<commit_message>
Initial installation of postgresql db has been completed.
</commit_message>
<xml_diff>
--- a/transportent.docx
+++ b/transportent.docx
@@ -40,6 +40,10 @@
     <w:p>
       <w:pPr>
         <w:pStyle w:val="Normal"/>
+        <w:numPr>
+          <w:ilvl w:val="0"/>
+          <w:numId w:val="1"/>
+        </w:numPr>
         <w:bidi w:val="0"/>
         <w:jc w:val="start"/>
         <w:rPr>
@@ -51,6 +55,42 @@
         <w:rPr>
           <w:b/>
           <w:bCs/>
+        </w:rPr>
+        <w:t>Quotation module</w:t>
+      </w:r>
+    </w:p>
+    <w:p>
+      <w:pPr>
+        <w:pStyle w:val="Normal"/>
+        <w:bidi w:val="0"/>
+        <w:jc w:val="start"/>
+        <w:rPr>
+          <w:b w:val="false"/>
+          <w:bCs w:val="false"/>
+        </w:rPr>
+      </w:pPr>
+      <w:r>
+        <w:rPr>
+          <w:b w:val="false"/>
+          <w:bCs w:val="false"/>
+        </w:rPr>
+        <w:t>Quotation module should have following data structure:</w:t>
+      </w:r>
+    </w:p>
+    <w:p>
+      <w:pPr>
+        <w:pStyle w:val="Normal"/>
+        <w:bidi w:val="0"/>
+        <w:jc w:val="start"/>
+        <w:rPr>
+          <w:b w:val="false"/>
+          <w:bCs w:val="false"/>
+        </w:rPr>
+      </w:pPr>
+      <w:r>
+        <w:rPr>
+          <w:b w:val="false"/>
+          <w:bCs w:val="false"/>
         </w:rPr>
       </w:r>
     </w:p>
@@ -64,6 +104,255 @@
     </w:sectPr>
   </w:body>
 </w:document>
+</file>
+
+<file path=word/numbering.xml><?xml version="1.0" encoding="utf-8"?>
+<w:numbering xmlns:w="http://schemas.openxmlformats.org/wordprocessingml/2006/main" xmlns:o="urn:schemas-microsoft-com:office:office" xmlns:r="http://schemas.openxmlformats.org/officeDocument/2006/relationships" xmlns:v="urn:schemas-microsoft-com:vml" xmlns:mc="http://schemas.openxmlformats.org/markup-compatibility/2006" xmlns:w14="http://schemas.microsoft.com/office/word/2010/wordml" mc:Ignorable="w14">
+  <w:abstractNum w:abstractNumId="1">
+    <w:lvl w:ilvl="0">
+      <w:start w:val="1"/>
+      <w:numFmt w:val="decimal"/>
+      <w:lvlText w:val="%1"/>
+      <w:lvlJc w:val="start"/>
+      <w:pPr>
+        <w:tabs>
+          <w:tab w:val="num" w:pos="720"/>
+        </w:tabs>
+        <w:ind w:start="720" w:hanging="360"/>
+      </w:pPr>
+      <w:rPr/>
+    </w:lvl>
+    <w:lvl w:ilvl="1">
+      <w:start w:val="1"/>
+      <w:numFmt w:val="decimal"/>
+      <w:lvlText w:val="%1.%2"/>
+      <w:lvlJc w:val="start"/>
+      <w:pPr>
+        <w:tabs>
+          <w:tab w:val="num" w:pos="1080"/>
+        </w:tabs>
+        <w:ind w:start="1080" w:hanging="360"/>
+      </w:pPr>
+      <w:rPr/>
+    </w:lvl>
+    <w:lvl w:ilvl="2">
+      <w:start w:val="1"/>
+      <w:numFmt w:val="decimal"/>
+      <w:lvlText w:val="%1.%2.%3"/>
+      <w:lvlJc w:val="start"/>
+      <w:pPr>
+        <w:tabs>
+          <w:tab w:val="num" w:pos="1440"/>
+        </w:tabs>
+        <w:ind w:start="1440" w:hanging="360"/>
+      </w:pPr>
+      <w:rPr/>
+    </w:lvl>
+    <w:lvl w:ilvl="3">
+      <w:start w:val="1"/>
+      <w:numFmt w:val="decimal"/>
+      <w:lvlText w:val="%1.%2.%3.%4"/>
+      <w:lvlJc w:val="start"/>
+      <w:pPr>
+        <w:tabs>
+          <w:tab w:val="num" w:pos="1800"/>
+        </w:tabs>
+        <w:ind w:start="1800" w:hanging="360"/>
+      </w:pPr>
+      <w:rPr/>
+    </w:lvl>
+    <w:lvl w:ilvl="4">
+      <w:start w:val="1"/>
+      <w:numFmt w:val="decimal"/>
+      <w:lvlText w:val="%1.%2.%3.%4.%5"/>
+      <w:lvlJc w:val="start"/>
+      <w:pPr>
+        <w:tabs>
+          <w:tab w:val="num" w:pos="2160"/>
+        </w:tabs>
+        <w:ind w:start="2160" w:hanging="360"/>
+      </w:pPr>
+      <w:rPr/>
+    </w:lvl>
+    <w:lvl w:ilvl="5">
+      <w:start w:val="1"/>
+      <w:numFmt w:val="decimal"/>
+      <w:lvlText w:val="%1.%2.%3.%4.%5.%6"/>
+      <w:lvlJc w:val="start"/>
+      <w:pPr>
+        <w:tabs>
+          <w:tab w:val="num" w:pos="2520"/>
+        </w:tabs>
+        <w:ind w:start="2520" w:hanging="360"/>
+      </w:pPr>
+      <w:rPr/>
+    </w:lvl>
+    <w:lvl w:ilvl="6">
+      <w:start w:val="1"/>
+      <w:numFmt w:val="decimal"/>
+      <w:lvlText w:val="%1.%2.%3.%4.%5.%6.%7"/>
+      <w:lvlJc w:val="start"/>
+      <w:pPr>
+        <w:tabs>
+          <w:tab w:val="num" w:pos="2880"/>
+        </w:tabs>
+        <w:ind w:start="2880" w:hanging="360"/>
+      </w:pPr>
+      <w:rPr/>
+    </w:lvl>
+    <w:lvl w:ilvl="7">
+      <w:start w:val="1"/>
+      <w:numFmt w:val="decimal"/>
+      <w:lvlText w:val="%1.%2.%3.%4.%5.%6.%7.%8"/>
+      <w:lvlJc w:val="start"/>
+      <w:pPr>
+        <w:tabs>
+          <w:tab w:val="num" w:pos="3240"/>
+        </w:tabs>
+        <w:ind w:start="3240" w:hanging="360"/>
+      </w:pPr>
+      <w:rPr/>
+    </w:lvl>
+    <w:lvl w:ilvl="8">
+      <w:start w:val="1"/>
+      <w:numFmt w:val="decimal"/>
+      <w:lvlText w:val="%1.%2.%3.%4.%5.%6.%7.%8.%9"/>
+      <w:lvlJc w:val="start"/>
+      <w:pPr>
+        <w:tabs>
+          <w:tab w:val="num" w:pos="3600"/>
+        </w:tabs>
+        <w:ind w:start="3600" w:hanging="360"/>
+      </w:pPr>
+      <w:rPr/>
+    </w:lvl>
+  </w:abstractNum>
+  <w:abstractNum w:abstractNumId="2">
+    <w:lvl w:ilvl="0">
+      <w:start w:val="1"/>
+      <w:numFmt w:val="none"/>
+      <w:suff w:val="nothing"/>
+      <w:lvlText w:val=""/>
+      <w:lvlJc w:val="start"/>
+      <w:pPr>
+        <w:tabs>
+          <w:tab w:val="num" w:pos="0"/>
+        </w:tabs>
+        <w:ind w:start="0" w:hanging="0"/>
+      </w:pPr>
+    </w:lvl>
+    <w:lvl w:ilvl="1">
+      <w:start w:val="1"/>
+      <w:numFmt w:val="none"/>
+      <w:suff w:val="nothing"/>
+      <w:lvlText w:val=""/>
+      <w:lvlJc w:val="start"/>
+      <w:pPr>
+        <w:tabs>
+          <w:tab w:val="num" w:pos="0"/>
+        </w:tabs>
+        <w:ind w:start="0" w:hanging="0"/>
+      </w:pPr>
+    </w:lvl>
+    <w:lvl w:ilvl="2">
+      <w:start w:val="1"/>
+      <w:numFmt w:val="none"/>
+      <w:suff w:val="nothing"/>
+      <w:lvlText w:val=""/>
+      <w:lvlJc w:val="start"/>
+      <w:pPr>
+        <w:tabs>
+          <w:tab w:val="num" w:pos="0"/>
+        </w:tabs>
+        <w:ind w:start="0" w:hanging="0"/>
+      </w:pPr>
+    </w:lvl>
+    <w:lvl w:ilvl="3">
+      <w:start w:val="1"/>
+      <w:numFmt w:val="none"/>
+      <w:suff w:val="nothing"/>
+      <w:lvlText w:val=""/>
+      <w:lvlJc w:val="start"/>
+      <w:pPr>
+        <w:tabs>
+          <w:tab w:val="num" w:pos="0"/>
+        </w:tabs>
+        <w:ind w:start="0" w:hanging="0"/>
+      </w:pPr>
+    </w:lvl>
+    <w:lvl w:ilvl="4">
+      <w:start w:val="1"/>
+      <w:numFmt w:val="none"/>
+      <w:suff w:val="nothing"/>
+      <w:lvlText w:val=""/>
+      <w:lvlJc w:val="start"/>
+      <w:pPr>
+        <w:tabs>
+          <w:tab w:val="num" w:pos="0"/>
+        </w:tabs>
+        <w:ind w:start="0" w:hanging="0"/>
+      </w:pPr>
+    </w:lvl>
+    <w:lvl w:ilvl="5">
+      <w:start w:val="1"/>
+      <w:numFmt w:val="none"/>
+      <w:suff w:val="nothing"/>
+      <w:lvlText w:val=""/>
+      <w:lvlJc w:val="start"/>
+      <w:pPr>
+        <w:tabs>
+          <w:tab w:val="num" w:pos="0"/>
+        </w:tabs>
+        <w:ind w:start="0" w:hanging="0"/>
+      </w:pPr>
+    </w:lvl>
+    <w:lvl w:ilvl="6">
+      <w:start w:val="1"/>
+      <w:numFmt w:val="none"/>
+      <w:suff w:val="nothing"/>
+      <w:lvlText w:val=""/>
+      <w:lvlJc w:val="start"/>
+      <w:pPr>
+        <w:tabs>
+          <w:tab w:val="num" w:pos="0"/>
+        </w:tabs>
+        <w:ind w:start="0" w:hanging="0"/>
+      </w:pPr>
+    </w:lvl>
+    <w:lvl w:ilvl="7">
+      <w:start w:val="1"/>
+      <w:numFmt w:val="none"/>
+      <w:suff w:val="nothing"/>
+      <w:lvlText w:val=""/>
+      <w:lvlJc w:val="start"/>
+      <w:pPr>
+        <w:tabs>
+          <w:tab w:val="num" w:pos="0"/>
+        </w:tabs>
+        <w:ind w:start="0" w:hanging="0"/>
+      </w:pPr>
+    </w:lvl>
+    <w:lvl w:ilvl="8">
+      <w:start w:val="1"/>
+      <w:numFmt w:val="none"/>
+      <w:suff w:val="nothing"/>
+      <w:lvlText w:val=""/>
+      <w:lvlJc w:val="start"/>
+      <w:pPr>
+        <w:tabs>
+          <w:tab w:val="num" w:pos="0"/>
+        </w:tabs>
+        <w:ind w:start="0" w:hanging="0"/>
+      </w:pPr>
+    </w:lvl>
+  </w:abstractNum>
+  <w:num w:numId="1">
+    <w:abstractNumId w:val="1"/>
+  </w:num>
+  <w:num w:numId="2">
+    <w:abstractNumId w:val="2"/>
+  </w:num>
+</w:numbering>
 </file>
 
 <file path=word/styles.xml><?xml version="1.0" encoding="utf-8"?>
@@ -100,6 +389,11 @@
       <w:szCs w:val="24"/>
       <w:lang w:val="en-US" w:eastAsia="zh-CN" w:bidi="hi-IN"/>
     </w:rPr>
+  </w:style>
+  <w:style w:type="character" w:styleId="NumberingSymbols">
+    <w:name w:val="Numbering Symbols"/>
+    <w:qFormat/>
+    <w:rPr/>
   </w:style>
   <w:style w:type="paragraph" w:styleId="Heading">
     <w:name w:val="Heading"/>

</xml_diff>

<commit_message>
Transportent.docx document has been updated.
</commit_message>
<xml_diff>
--- a/transportent.docx
+++ b/transportent.docx
@@ -200,6 +200,382 @@
           <w:b/>
           <w:bCs/>
         </w:rPr>
+        <w:t>Quotation header table</w:t>
+      </w:r>
+    </w:p>
+    <w:p>
+      <w:pPr>
+        <w:pStyle w:val="Normal"/>
+        <w:bidi w:val="0"/>
+        <w:jc w:val="start"/>
+        <w:rPr>
+          <w:b w:val="false"/>
+          <w:bCs w:val="false"/>
+        </w:rPr>
+      </w:pPr>
+      <w:r>
+        <w:rPr>
+          <w:b w:val="false"/>
+          <w:bCs w:val="false"/>
+        </w:rPr>
+        <w:t xml:space="preserve">- quotation id </w:t>
+      </w:r>
+    </w:p>
+    <w:p>
+      <w:pPr>
+        <w:pStyle w:val="Normal"/>
+        <w:bidi w:val="0"/>
+        <w:jc w:val="start"/>
+        <w:rPr>
+          <w:b w:val="false"/>
+          <w:bCs w:val="false"/>
+        </w:rPr>
+      </w:pPr>
+      <w:r>
+        <w:rPr>
+          <w:b w:val="false"/>
+          <w:bCs w:val="false"/>
+        </w:rPr>
+        <w:t>- account id</w:t>
+      </w:r>
+    </w:p>
+    <w:p>
+      <w:pPr>
+        <w:pStyle w:val="Normal"/>
+        <w:bidi w:val="0"/>
+        <w:jc w:val="start"/>
+        <w:rPr>
+          <w:b w:val="false"/>
+          <w:bCs w:val="false"/>
+        </w:rPr>
+      </w:pPr>
+      <w:r>
+        <w:rPr>
+          <w:b w:val="false"/>
+          <w:bCs w:val="false"/>
+        </w:rPr>
+        <w:t>- date</w:t>
+      </w:r>
+    </w:p>
+    <w:p>
+      <w:pPr>
+        <w:pStyle w:val="Normal"/>
+        <w:bidi w:val="0"/>
+        <w:jc w:val="start"/>
+        <w:rPr>
+          <w:b w:val="false"/>
+          <w:bCs w:val="false"/>
+        </w:rPr>
+      </w:pPr>
+      <w:r>
+        <w:rPr>
+          <w:b w:val="false"/>
+          <w:bCs w:val="false"/>
+        </w:rPr>
+        <w:t>- created date</w:t>
+      </w:r>
+    </w:p>
+    <w:p>
+      <w:pPr>
+        <w:pStyle w:val="Normal"/>
+        <w:bidi w:val="0"/>
+        <w:jc w:val="start"/>
+        <w:rPr>
+          <w:b w:val="false"/>
+          <w:bCs w:val="false"/>
+        </w:rPr>
+      </w:pPr>
+      <w:r>
+        <w:rPr>
+          <w:b w:val="false"/>
+          <w:bCs w:val="false"/>
+        </w:rPr>
+        <w:t>- created by</w:t>
+      </w:r>
+    </w:p>
+    <w:p>
+      <w:pPr>
+        <w:pStyle w:val="Normal"/>
+        <w:bidi w:val="0"/>
+        <w:jc w:val="start"/>
+        <w:rPr>
+          <w:b w:val="false"/>
+          <w:bCs w:val="false"/>
+        </w:rPr>
+      </w:pPr>
+      <w:r>
+        <w:rPr>
+          <w:b w:val="false"/>
+          <w:bCs w:val="false"/>
+        </w:rPr>
+        <w:t>- modified date</w:t>
+      </w:r>
+    </w:p>
+    <w:p>
+      <w:pPr>
+        <w:pStyle w:val="Normal"/>
+        <w:bidi w:val="0"/>
+        <w:jc w:val="start"/>
+        <w:rPr>
+          <w:b w:val="false"/>
+          <w:bCs w:val="false"/>
+        </w:rPr>
+      </w:pPr>
+      <w:r>
+        <w:rPr>
+          <w:b w:val="false"/>
+          <w:bCs w:val="false"/>
+        </w:rPr>
+        <w:t>- modified by</w:t>
+      </w:r>
+    </w:p>
+    <w:p>
+      <w:pPr>
+        <w:pStyle w:val="Normal"/>
+        <w:bidi w:val="0"/>
+        <w:jc w:val="start"/>
+        <w:rPr>
+          <w:b w:val="false"/>
+          <w:bCs w:val="false"/>
+        </w:rPr>
+      </w:pPr>
+      <w:r>
+        <w:rPr>
+          <w:b w:val="false"/>
+          <w:bCs w:val="false"/>
+        </w:rPr>
+        <w:t>- data area id</w:t>
+      </w:r>
+    </w:p>
+    <w:p>
+      <w:pPr>
+        <w:pStyle w:val="Normal"/>
+        <w:bidi w:val="0"/>
+        <w:jc w:val="start"/>
+        <w:rPr>
+          <w:b w:val="false"/>
+          <w:bCs w:val="false"/>
+        </w:rPr>
+      </w:pPr>
+      <w:r>
+        <w:rPr>
+          <w:b w:val="false"/>
+          <w:bCs w:val="false"/>
+        </w:rPr>
+      </w:r>
+    </w:p>
+    <w:p>
+      <w:pPr>
+        <w:pStyle w:val="Normal"/>
+        <w:bidi w:val="0"/>
+        <w:jc w:val="start"/>
+        <w:rPr>
+          <w:b/>
+          <w:bCs/>
+        </w:rPr>
+      </w:pPr>
+      <w:r>
+        <w:rPr>
+          <w:b/>
+          <w:bCs/>
+        </w:rPr>
+        <w:t>Quotation line</w:t>
+      </w:r>
+    </w:p>
+    <w:p>
+      <w:pPr>
+        <w:pStyle w:val="Normal"/>
+        <w:bidi w:val="0"/>
+        <w:jc w:val="start"/>
+        <w:rPr>
+          <w:b w:val="false"/>
+          <w:bCs w:val="false"/>
+        </w:rPr>
+      </w:pPr>
+      <w:r>
+        <w:rPr>
+          <w:b w:val="false"/>
+          <w:bCs w:val="false"/>
+        </w:rPr>
+        <w:t>- quotation id</w:t>
+      </w:r>
+    </w:p>
+    <w:p>
+      <w:pPr>
+        <w:pStyle w:val="Normal"/>
+        <w:bidi w:val="0"/>
+        <w:jc w:val="start"/>
+        <w:rPr>
+          <w:b w:val="false"/>
+          <w:bCs w:val="false"/>
+        </w:rPr>
+      </w:pPr>
+      <w:r>
+        <w:rPr>
+          <w:b w:val="false"/>
+          <w:bCs w:val="false"/>
+        </w:rPr>
+        <w:t>- load id</w:t>
+      </w:r>
+    </w:p>
+    <w:p>
+      <w:pPr>
+        <w:pStyle w:val="Normal"/>
+        <w:bidi w:val="0"/>
+        <w:jc w:val="start"/>
+        <w:rPr>
+          <w:b w:val="false"/>
+          <w:bCs w:val="false"/>
+        </w:rPr>
+      </w:pPr>
+      <w:r>
+        <w:rPr>
+          <w:b w:val="false"/>
+          <w:bCs w:val="false"/>
+        </w:rPr>
+        <w:t>- net amount</w:t>
+      </w:r>
+    </w:p>
+    <w:p>
+      <w:pPr>
+        <w:pStyle w:val="Normal"/>
+        <w:bidi w:val="0"/>
+        <w:jc w:val="start"/>
+        <w:rPr>
+          <w:b w:val="false"/>
+          <w:bCs w:val="false"/>
+        </w:rPr>
+      </w:pPr>
+      <w:r>
+        <w:rPr>
+          <w:b w:val="false"/>
+          <w:bCs w:val="false"/>
+        </w:rPr>
+        <w:t>- currency</w:t>
+      </w:r>
+    </w:p>
+    <w:p>
+      <w:pPr>
+        <w:pStyle w:val="Normal"/>
+        <w:bidi w:val="0"/>
+        <w:jc w:val="start"/>
+        <w:rPr>
+          <w:b w:val="false"/>
+          <w:bCs w:val="false"/>
+        </w:rPr>
+      </w:pPr>
+      <w:r>
+        <w:rPr>
+          <w:b w:val="false"/>
+          <w:bCs w:val="false"/>
+        </w:rPr>
+        <w:t>- created date</w:t>
+      </w:r>
+    </w:p>
+    <w:p>
+      <w:pPr>
+        <w:pStyle w:val="Normal"/>
+        <w:bidi w:val="0"/>
+        <w:jc w:val="start"/>
+        <w:rPr>
+          <w:b w:val="false"/>
+          <w:bCs w:val="false"/>
+        </w:rPr>
+      </w:pPr>
+      <w:r>
+        <w:rPr>
+          <w:b w:val="false"/>
+          <w:bCs w:val="false"/>
+        </w:rPr>
+        <w:t>- created by</w:t>
+      </w:r>
+    </w:p>
+    <w:p>
+      <w:pPr>
+        <w:pStyle w:val="Normal"/>
+        <w:bidi w:val="0"/>
+        <w:jc w:val="start"/>
+        <w:rPr>
+          <w:b w:val="false"/>
+          <w:bCs w:val="false"/>
+        </w:rPr>
+      </w:pPr>
+      <w:r>
+        <w:rPr>
+          <w:b w:val="false"/>
+          <w:bCs w:val="false"/>
+        </w:rPr>
+        <w:t>- modified date</w:t>
+      </w:r>
+    </w:p>
+    <w:p>
+      <w:pPr>
+        <w:pStyle w:val="Normal"/>
+        <w:bidi w:val="0"/>
+        <w:jc w:val="start"/>
+        <w:rPr>
+          <w:b w:val="false"/>
+          <w:bCs w:val="false"/>
+        </w:rPr>
+      </w:pPr>
+      <w:r>
+        <w:rPr>
+          <w:b w:val="false"/>
+          <w:bCs w:val="false"/>
+        </w:rPr>
+        <w:t>- modified by</w:t>
+      </w:r>
+    </w:p>
+    <w:p>
+      <w:pPr>
+        <w:pStyle w:val="Normal"/>
+        <w:bidi w:val="0"/>
+        <w:jc w:val="start"/>
+        <w:rPr>
+          <w:b w:val="false"/>
+          <w:bCs w:val="false"/>
+        </w:rPr>
+      </w:pPr>
+      <w:r>
+        <w:rPr>
+          <w:b w:val="false"/>
+          <w:bCs w:val="false"/>
+        </w:rPr>
+        <w:t xml:space="preserve">- data area id </w:t>
+      </w:r>
+    </w:p>
+    <w:p>
+      <w:pPr>
+        <w:pStyle w:val="Normal"/>
+        <w:bidi w:val="0"/>
+        <w:jc w:val="start"/>
+        <w:rPr>
+          <w:b/>
+          <w:bCs/>
+        </w:rPr>
+      </w:pPr>
+      <w:r>
+        <w:rPr>
+          <w:b/>
+          <w:bCs/>
+        </w:rPr>
+      </w:r>
+    </w:p>
+    <w:p>
+      <w:pPr>
+        <w:pStyle w:val="Normal"/>
+        <w:bidi w:val="0"/>
+        <w:jc w:val="start"/>
+        <w:rPr>
+          <w:b/>
+          <w:bCs/>
+        </w:rPr>
+      </w:pPr>
+      <w:r>
+        <w:rPr>
+          <w:b/>
+          <w:bCs/>
+        </w:rPr>
         <w:t xml:space="preserve">Load </w:t>
       </w:r>
       <w:r>
@@ -397,7 +773,25 @@
           <w:b w:val="false"/>
           <w:bCs w:val="false"/>
         </w:rPr>
-        <w:t>- modiefied by</w:t>
+        <w:t>- modified by</w:t>
+      </w:r>
+    </w:p>
+    <w:p>
+      <w:pPr>
+        <w:pStyle w:val="Normal"/>
+        <w:bidi w:val="0"/>
+        <w:jc w:val="start"/>
+        <w:rPr>
+          <w:b w:val="false"/>
+          <w:bCs w:val="false"/>
+        </w:rPr>
+      </w:pPr>
+      <w:r>
+        <w:rPr>
+          <w:b w:val="false"/>
+          <w:bCs w:val="false"/>
+        </w:rPr>
+        <w:t>- data area id</w:t>
       </w:r>
     </w:p>
     <w:p>
@@ -450,6 +844,24 @@
           <w:b w:val="false"/>
           <w:bCs w:val="false"/>
         </w:rPr>
+        <w:t>- load id</w:t>
+      </w:r>
+    </w:p>
+    <w:p>
+      <w:pPr>
+        <w:pStyle w:val="Normal"/>
+        <w:bidi w:val="0"/>
+        <w:jc w:val="start"/>
+        <w:rPr>
+          <w:b w:val="false"/>
+          <w:bCs w:val="false"/>
+        </w:rPr>
+      </w:pPr>
+      <w:r>
+        <w:rPr>
+          <w:b w:val="false"/>
+          <w:bCs w:val="false"/>
+        </w:rPr>
         <w:t>- shipment id</w:t>
       </w:r>
     </w:p>
@@ -522,7 +934,25 @@
           <w:b w:val="false"/>
           <w:bCs w:val="false"/>
         </w:rPr>
-        <w:t>- modiefied by</w:t>
+        <w:t>- modified by</w:t>
+      </w:r>
+    </w:p>
+    <w:p>
+      <w:pPr>
+        <w:pStyle w:val="Normal"/>
+        <w:bidi w:val="0"/>
+        <w:jc w:val="start"/>
+        <w:rPr>
+          <w:b w:val="false"/>
+          <w:bCs w:val="false"/>
+        </w:rPr>
+      </w:pPr>
+      <w:r>
+        <w:rPr>
+          <w:b w:val="false"/>
+          <w:bCs w:val="false"/>
+        </w:rPr>
+        <w:t>- data area id</w:t>
       </w:r>
     </w:p>
     <w:p>
@@ -780,7 +1210,25 @@
           <w:b w:val="false"/>
           <w:bCs w:val="false"/>
         </w:rPr>
-        <w:t>- modiefied by</w:t>
+        <w:t>- modified by</w:t>
+      </w:r>
+    </w:p>
+    <w:p>
+      <w:pPr>
+        <w:pStyle w:val="Normal"/>
+        <w:bidi w:val="0"/>
+        <w:jc w:val="start"/>
+        <w:rPr>
+          <w:b w:val="false"/>
+          <w:bCs w:val="false"/>
+        </w:rPr>
+      </w:pPr>
+      <w:r>
+        <w:rPr>
+          <w:b w:val="false"/>
+          <w:bCs w:val="false"/>
+        </w:rPr>
+        <w:t>- data area id</w:t>
       </w:r>
     </w:p>
     <w:p>
@@ -840,6 +1288,24 @@
           <w:b w:val="false"/>
           <w:bCs w:val="false"/>
         </w:rPr>
+        <w:t>- shipment id</w:t>
+      </w:r>
+    </w:p>
+    <w:p>
+      <w:pPr>
+        <w:pStyle w:val="Normal"/>
+        <w:bidi w:val="0"/>
+        <w:jc w:val="start"/>
+        <w:rPr>
+          <w:b w:val="false"/>
+          <w:bCs w:val="false"/>
+        </w:rPr>
+      </w:pPr>
+      <w:r>
+        <w:rPr>
+          <w:b w:val="false"/>
+          <w:bCs w:val="false"/>
+        </w:rPr>
         <w:t>- item id (reference to item table)</w:t>
       </w:r>
     </w:p>
@@ -984,7 +1450,25 @@
           <w:b w:val="false"/>
           <w:bCs w:val="false"/>
         </w:rPr>
-        <w:t>- modiefied by</w:t>
+        <w:t>- modified by</w:t>
+      </w:r>
+    </w:p>
+    <w:p>
+      <w:pPr>
+        <w:pStyle w:val="Normal"/>
+        <w:bidi w:val="0"/>
+        <w:jc w:val="start"/>
+        <w:rPr>
+          <w:b w:val="false"/>
+          <w:bCs w:val="false"/>
+        </w:rPr>
+      </w:pPr>
+      <w:r>
+        <w:rPr>
+          <w:b w:val="false"/>
+          <w:bCs w:val="false"/>
+        </w:rPr>
+        <w:t>- data area id</w:t>
       </w:r>
     </w:p>
     <w:p>
@@ -1055,18 +1539,22 @@
           <w:b w:val="false"/>
           <w:bCs w:val="false"/>
         </w:rPr>
-        <w:t>- delivery address (list of delivery addresses)</w:t>
-      </w:r>
-    </w:p>
-    <w:p>
-      <w:pPr>
-        <w:pStyle w:val="Normal"/>
-        <w:bidi w:val="0"/>
-        <w:jc w:val="start"/>
-        <w:rPr>
-          <w:b w:val="false"/>
-          <w:bCs w:val="false"/>
-        </w:rPr>
+        <w:t xml:space="preserve">- </w:t>
+      </w:r>
+      <w:r>
+        <w:rPr>
+          <w:b w:val="false"/>
+          <w:bCs w:val="false"/>
+        </w:rPr>
+        <w:t>account name</w:t>
+      </w:r>
+    </w:p>
+    <w:p>
+      <w:pPr>
+        <w:pStyle w:val="Normal"/>
+        <w:bidi w:val="0"/>
+        <w:jc w:val="start"/>
+        <w:rPr/>
       </w:pPr>
       <w:r>
         <w:rPr>
@@ -1127,7 +1615,25 @@
           <w:b w:val="false"/>
           <w:bCs w:val="false"/>
         </w:rPr>
-        <w:t>- modiefied by</w:t>
+        <w:t>- modified by</w:t>
+      </w:r>
+    </w:p>
+    <w:p>
+      <w:pPr>
+        <w:pStyle w:val="Normal"/>
+        <w:bidi w:val="0"/>
+        <w:jc w:val="start"/>
+        <w:rPr>
+          <w:b w:val="false"/>
+          <w:bCs w:val="false"/>
+        </w:rPr>
+      </w:pPr>
+      <w:r>
+        <w:rPr>
+          <w:b w:val="false"/>
+          <w:bCs w:val="false"/>
+        </w:rPr>
+        <w:t>- data area id</w:t>
       </w:r>
     </w:p>
     <w:p>
@@ -1288,6 +1794,31 @@
           <w:b w:val="false"/>
           <w:bCs w:val="false"/>
         </w:rPr>
+        <w:t xml:space="preserve">- </w:t>
+      </w:r>
+      <w:r>
+        <w:rPr>
+          <w:b w:val="false"/>
+          <w:bCs w:val="false"/>
+        </w:rPr>
+        <w:t>account id</w:t>
+      </w:r>
+    </w:p>
+    <w:p>
+      <w:pPr>
+        <w:pStyle w:val="Normal"/>
+        <w:bidi w:val="0"/>
+        <w:jc w:val="start"/>
+        <w:rPr>
+          <w:b w:val="false"/>
+          <w:bCs w:val="false"/>
+        </w:rPr>
+      </w:pPr>
+      <w:r>
+        <w:rPr>
+          <w:b w:val="false"/>
+          <w:bCs w:val="false"/>
+        </w:rPr>
         <w:t>- created date</w:t>
       </w:r>
     </w:p>
@@ -1342,7 +1873,25 @@
           <w:b w:val="false"/>
           <w:bCs w:val="false"/>
         </w:rPr>
-        <w:t>- modiefied by</w:t>
+        <w:t>- modified by</w:t>
+      </w:r>
+    </w:p>
+    <w:p>
+      <w:pPr>
+        <w:pStyle w:val="Normal"/>
+        <w:bidi w:val="0"/>
+        <w:jc w:val="start"/>
+        <w:rPr>
+          <w:b w:val="false"/>
+          <w:bCs w:val="false"/>
+        </w:rPr>
+      </w:pPr>
+      <w:r>
+        <w:rPr>
+          <w:b w:val="false"/>
+          <w:bCs w:val="false"/>
+        </w:rPr>
+        <w:t>- data area id</w:t>
       </w:r>
     </w:p>
     <w:p>
@@ -1485,7 +2034,25 @@
           <w:b w:val="false"/>
           <w:bCs w:val="false"/>
         </w:rPr>
-        <w:t>- modiefied by</w:t>
+        <w:t>- modified by</w:t>
+      </w:r>
+    </w:p>
+    <w:p>
+      <w:pPr>
+        <w:pStyle w:val="Normal"/>
+        <w:bidi w:val="0"/>
+        <w:jc w:val="start"/>
+        <w:rPr>
+          <w:b w:val="false"/>
+          <w:bCs w:val="false"/>
+        </w:rPr>
+      </w:pPr>
+      <w:r>
+        <w:rPr>
+          <w:b w:val="false"/>
+          <w:bCs w:val="false"/>
+        </w:rPr>
+        <w:t>- data area id</w:t>
       </w:r>
     </w:p>
     <w:p>
@@ -1556,6 +2123,31 @@
           <w:b w:val="false"/>
           <w:bCs w:val="false"/>
         </w:rPr>
+        <w:t xml:space="preserve">- </w:t>
+      </w:r>
+      <w:r>
+        <w:rPr>
+          <w:b w:val="false"/>
+          <w:bCs w:val="false"/>
+        </w:rPr>
+        <w:t>zip code</w:t>
+      </w:r>
+    </w:p>
+    <w:p>
+      <w:pPr>
+        <w:pStyle w:val="Normal"/>
+        <w:bidi w:val="0"/>
+        <w:jc w:val="start"/>
+        <w:rPr>
+          <w:b w:val="false"/>
+          <w:bCs w:val="false"/>
+        </w:rPr>
+      </w:pPr>
+      <w:r>
+        <w:rPr>
+          <w:b w:val="false"/>
+          <w:bCs w:val="false"/>
+        </w:rPr>
         <w:t>- country id (reference to country table)</w:t>
       </w:r>
     </w:p>
@@ -1628,7 +2220,25 @@
           <w:b w:val="false"/>
           <w:bCs w:val="false"/>
         </w:rPr>
-        <w:t>- modiefied by</w:t>
+        <w:t>- modified by</w:t>
+      </w:r>
+    </w:p>
+    <w:p>
+      <w:pPr>
+        <w:pStyle w:val="Normal"/>
+        <w:bidi w:val="0"/>
+        <w:jc w:val="start"/>
+        <w:rPr>
+          <w:b w:val="false"/>
+          <w:bCs w:val="false"/>
+        </w:rPr>
+      </w:pPr>
+      <w:r>
+        <w:rPr>
+          <w:b w:val="false"/>
+          <w:bCs w:val="false"/>
+        </w:rPr>
+        <w:t>- data area id</w:t>
       </w:r>
     </w:p>
     <w:p>
@@ -1681,7 +2291,7 @@
           <w:b w:val="false"/>
           <w:bCs w:val="false"/>
         </w:rPr>
-        <w:t>- company id</w:t>
+        <w:t>- data area id</w:t>
       </w:r>
     </w:p>
     <w:p>
@@ -1825,7 +2435,25 @@
           <w:b w:val="false"/>
           <w:bCs w:val="false"/>
         </w:rPr>
-        <w:t>- modiefied by</w:t>
+        <w:t>- modified by</w:t>
+      </w:r>
+    </w:p>
+    <w:p>
+      <w:pPr>
+        <w:pStyle w:val="Normal"/>
+        <w:bidi w:val="0"/>
+        <w:jc w:val="start"/>
+        <w:rPr>
+          <w:b w:val="false"/>
+          <w:bCs w:val="false"/>
+        </w:rPr>
+      </w:pPr>
+      <w:r>
+        <w:rPr>
+          <w:b w:val="false"/>
+          <w:bCs w:val="false"/>
+        </w:rPr>
+        <w:t>- data area id</w:t>
       </w:r>
     </w:p>
     <w:p>
@@ -1968,7 +2596,25 @@
           <w:b w:val="false"/>
           <w:bCs w:val="false"/>
         </w:rPr>
-        <w:t>- modiefied by</w:t>
+        <w:t>- modified by</w:t>
+      </w:r>
+    </w:p>
+    <w:p>
+      <w:pPr>
+        <w:pStyle w:val="Normal"/>
+        <w:bidi w:val="0"/>
+        <w:jc w:val="start"/>
+        <w:rPr>
+          <w:b w:val="false"/>
+          <w:bCs w:val="false"/>
+        </w:rPr>
+      </w:pPr>
+      <w:r>
+        <w:rPr>
+          <w:b w:val="false"/>
+          <w:bCs w:val="false"/>
+        </w:rPr>
+        <w:t>- data area id</w:t>
       </w:r>
     </w:p>
     <w:p>
@@ -2075,6 +2721,96 @@
           <w:b w:val="false"/>
           <w:bCs w:val="false"/>
         </w:rPr>
+        <w:t>- created date</w:t>
+      </w:r>
+    </w:p>
+    <w:p>
+      <w:pPr>
+        <w:pStyle w:val="Normal"/>
+        <w:bidi w:val="0"/>
+        <w:jc w:val="start"/>
+        <w:rPr>
+          <w:b w:val="false"/>
+          <w:bCs w:val="false"/>
+        </w:rPr>
+      </w:pPr>
+      <w:r>
+        <w:rPr>
+          <w:b w:val="false"/>
+          <w:bCs w:val="false"/>
+        </w:rPr>
+        <w:t>- created by</w:t>
+      </w:r>
+    </w:p>
+    <w:p>
+      <w:pPr>
+        <w:pStyle w:val="Normal"/>
+        <w:bidi w:val="0"/>
+        <w:jc w:val="start"/>
+        <w:rPr>
+          <w:b w:val="false"/>
+          <w:bCs w:val="false"/>
+        </w:rPr>
+      </w:pPr>
+      <w:r>
+        <w:rPr>
+          <w:b w:val="false"/>
+          <w:bCs w:val="false"/>
+        </w:rPr>
+        <w:t>- modified date</w:t>
+      </w:r>
+    </w:p>
+    <w:p>
+      <w:pPr>
+        <w:pStyle w:val="Normal"/>
+        <w:bidi w:val="0"/>
+        <w:jc w:val="start"/>
+        <w:rPr>
+          <w:b w:val="false"/>
+          <w:bCs w:val="false"/>
+        </w:rPr>
+      </w:pPr>
+      <w:r>
+        <w:rPr>
+          <w:b w:val="false"/>
+          <w:bCs w:val="false"/>
+        </w:rPr>
+        <w:t>- modified by</w:t>
+      </w:r>
+    </w:p>
+    <w:p>
+      <w:pPr>
+        <w:pStyle w:val="Normal"/>
+        <w:bidi w:val="0"/>
+        <w:jc w:val="start"/>
+        <w:rPr>
+          <w:b w:val="false"/>
+          <w:bCs w:val="false"/>
+        </w:rPr>
+      </w:pPr>
+      <w:r>
+        <w:rPr>
+          <w:b w:val="false"/>
+          <w:bCs w:val="false"/>
+        </w:rPr>
+        <w:t>- data area id</w:t>
+      </w:r>
+    </w:p>
+    <w:p>
+      <w:pPr>
+        <w:pStyle w:val="Normal"/>
+        <w:bidi w:val="0"/>
+        <w:jc w:val="start"/>
+        <w:rPr>
+          <w:b w:val="false"/>
+          <w:bCs w:val="false"/>
+        </w:rPr>
+      </w:pPr>
+      <w:r>
+        <w:rPr>
+          <w:b w:val="false"/>
+          <w:bCs w:val="false"/>
+        </w:rPr>
       </w:r>
     </w:p>
     <w:p>
@@ -2164,41 +2900,150 @@
           <w:b w:val="false"/>
           <w:bCs w:val="false"/>
         </w:rPr>
-      </w:r>
-    </w:p>
-    <w:p>
-      <w:pPr>
-        <w:pStyle w:val="Normal"/>
-        <w:bidi w:val="0"/>
-        <w:jc w:val="start"/>
-        <w:rPr>
-          <w:b w:val="false"/>
-          <w:bCs w:val="false"/>
-        </w:rPr>
-      </w:pPr>
-      <w:r>
-        <w:rPr>
-          <w:b w:val="false"/>
-          <w:bCs w:val="false"/>
-        </w:rPr>
-      </w:r>
-    </w:p>
-    <w:p>
-      <w:pPr>
-        <w:pStyle w:val="Normal"/>
-        <w:bidi w:val="0"/>
-        <w:jc w:val="start"/>
-        <w:rPr>
-          <w:b w:val="false"/>
-          <w:bCs w:val="false"/>
-        </w:rPr>
-      </w:pPr>
-      <w:r>
-        <w:rPr>
-          <w:b w:val="false"/>
-          <w:bCs w:val="false"/>
-        </w:rPr>
-        <w:t>Quote</w:t>
+        <w:t>- created date</w:t>
+      </w:r>
+    </w:p>
+    <w:p>
+      <w:pPr>
+        <w:pStyle w:val="Normal"/>
+        <w:bidi w:val="0"/>
+        <w:jc w:val="start"/>
+        <w:rPr>
+          <w:b w:val="false"/>
+          <w:bCs w:val="false"/>
+        </w:rPr>
+      </w:pPr>
+      <w:r>
+        <w:rPr>
+          <w:b w:val="false"/>
+          <w:bCs w:val="false"/>
+        </w:rPr>
+        <w:t>- created by</w:t>
+      </w:r>
+    </w:p>
+    <w:p>
+      <w:pPr>
+        <w:pStyle w:val="Normal"/>
+        <w:bidi w:val="0"/>
+        <w:jc w:val="start"/>
+        <w:rPr>
+          <w:b w:val="false"/>
+          <w:bCs w:val="false"/>
+        </w:rPr>
+      </w:pPr>
+      <w:r>
+        <w:rPr>
+          <w:b w:val="false"/>
+          <w:bCs w:val="false"/>
+        </w:rPr>
+        <w:t>- modified date</w:t>
+      </w:r>
+    </w:p>
+    <w:p>
+      <w:pPr>
+        <w:pStyle w:val="Normal"/>
+        <w:bidi w:val="0"/>
+        <w:jc w:val="start"/>
+        <w:rPr>
+          <w:b w:val="false"/>
+          <w:bCs w:val="false"/>
+        </w:rPr>
+      </w:pPr>
+      <w:r>
+        <w:rPr>
+          <w:b w:val="false"/>
+          <w:bCs w:val="false"/>
+        </w:rPr>
+        <w:t>- modified by</w:t>
+      </w:r>
+    </w:p>
+    <w:p>
+      <w:pPr>
+        <w:pStyle w:val="Normal"/>
+        <w:bidi w:val="0"/>
+        <w:jc w:val="start"/>
+        <w:rPr>
+          <w:b w:val="false"/>
+          <w:bCs w:val="false"/>
+        </w:rPr>
+      </w:pPr>
+      <w:r>
+        <w:rPr>
+          <w:b w:val="false"/>
+          <w:bCs w:val="false"/>
+        </w:rPr>
+        <w:t>- data area id</w:t>
+      </w:r>
+    </w:p>
+    <w:p>
+      <w:pPr>
+        <w:pStyle w:val="Normal"/>
+        <w:bidi w:val="0"/>
+        <w:jc w:val="start"/>
+        <w:rPr>
+          <w:b w:val="false"/>
+          <w:bCs w:val="false"/>
+        </w:rPr>
+      </w:pPr>
+      <w:r>
+        <w:rPr>
+          <w:b w:val="false"/>
+          <w:bCs w:val="false"/>
+        </w:rPr>
+      </w:r>
+    </w:p>
+    <w:p>
+      <w:pPr>
+        <w:pStyle w:val="Normal"/>
+        <w:bidi w:val="0"/>
+        <w:jc w:val="start"/>
+        <w:rPr>
+          <w:b/>
+          <w:bCs/>
+        </w:rPr>
+      </w:pPr>
+      <w:r>
+        <w:rPr>
+          <w:b/>
+          <w:bCs/>
+        </w:rPr>
+        <w:t>Currency</w:t>
+      </w:r>
+    </w:p>
+    <w:p>
+      <w:pPr>
+        <w:pStyle w:val="Normal"/>
+        <w:bidi w:val="0"/>
+        <w:jc w:val="start"/>
+        <w:rPr>
+          <w:b w:val="false"/>
+          <w:bCs w:val="false"/>
+        </w:rPr>
+      </w:pPr>
+      <w:r>
+        <w:rPr>
+          <w:b w:val="false"/>
+          <w:bCs w:val="false"/>
+        </w:rPr>
+        <w:t>- currency code</w:t>
+      </w:r>
+    </w:p>
+    <w:p>
+      <w:pPr>
+        <w:pStyle w:val="Normal"/>
+        <w:bidi w:val="0"/>
+        <w:jc w:val="start"/>
+        <w:rPr>
+          <w:b w:val="false"/>
+          <w:bCs w:val="false"/>
+        </w:rPr>
+      </w:pPr>
+      <w:r>
+        <w:rPr>
+          <w:b w:val="false"/>
+          <w:bCs w:val="false"/>
+        </w:rPr>
+        <w:t>- currency name</w:t>
       </w:r>
     </w:p>
     <w:p>

</xml_diff>

<commit_message>
Db schema draw.io has been updated.
</commit_message>
<xml_diff>
--- a/transportent.docx
+++ b/transportent.docx
@@ -1156,24 +1156,6 @@
           <w:b w:val="false"/>
           <w:bCs w:val="false"/>
         </w:rPr>
-        <w:t xml:space="preserve">- account name </w:t>
-      </w:r>
-    </w:p>
-    <w:p>
-      <w:pPr>
-        <w:pStyle w:val="Normal"/>
-        <w:bidi w:val="0"/>
-        <w:jc w:val="start"/>
-        <w:rPr>
-          <w:b w:val="false"/>
-          <w:bCs w:val="false"/>
-        </w:rPr>
-      </w:pPr>
-      <w:r>
-        <w:rPr>
-          <w:b w:val="false"/>
-          <w:bCs w:val="false"/>
-        </w:rPr>
         <w:t>- pick up address (reference to address table linked to organization id (data area))</w:t>
       </w:r>
     </w:p>
@@ -1319,6 +1301,41 @@
           <w:bCs w:val="false"/>
         </w:rPr>
         <w:t>- data area id</w:t>
+      </w:r>
+    </w:p>
+    <w:p>
+      <w:pPr>
+        <w:pStyle w:val="Normal"/>
+        <w:bidi w:val="0"/>
+        <w:jc w:val="start"/>
+        <w:rPr>
+          <w:b w:val="false"/>
+          <w:bCs w:val="false"/>
+        </w:rPr>
+      </w:pPr>
+      <w:r>
+        <w:rPr>
+          <w:b w:val="false"/>
+          <w:bCs w:val="false"/>
+        </w:rPr>
+      </w:r>
+    </w:p>
+    <w:p>
+      <w:pPr>
+        <w:pStyle w:val="Normal"/>
+        <w:bidi w:val="0"/>
+        <w:jc w:val="start"/>
+        <w:rPr>
+          <w:b w:val="false"/>
+          <w:bCs w:val="false"/>
+        </w:rPr>
+      </w:pPr>
+      <w:r>
+        <w:rPr>
+          <w:b w:val="false"/>
+          <w:bCs w:val="false"/>
+        </w:rPr>
+        <w:t>A shipment can be linked to only one load — shipment_id must be unique within Load lines (a shipment cannot appear on more than one load).</w:t>
       </w:r>
     </w:p>
     <w:p>

</xml_diff>